<commit_message>
Split 10 long, subordinate-clause-heavy sentences in the report for readability
Both graders flagged a recurring pattern of 75-104 word sentences as the
main remaining gap between H2.1 and H1 language quality. Rewrote each as
2-3 shorter sentences across the Introduction, Dashboard Migration,
Critical Analysis, Testing Strategy, and CI/CD sections, preserving all
technical content and citations. Re-validated against the template XSD
and re-rendered to confirm no auto-numbering or pagination regressions;
still 6 pages.
</commit_message>
<xml_diff>
--- a/documents/Gundeti_Sachin_Reddy_X23432721/report.docx
+++ b/documents/Gundeti_Sachin_Reddy_X23432721/report.docx
@@ -119,7 +119,7 @@
         <w:pStyle w:val="BodyText"/>
       </w:pPr>
       <w:r>
-        <w:t xml:space="preserve">This paper documents the design and construction of a fog and edge computing solution for this domain, built as an individual assignment for the Fog and Edge Computing (H9FECC) module. The brief for this coursework required, at minimum: (1) a sensor and fog layer generating data from three to five distinct sensor types with independently configurable sampling and dispatch rates, where the fog node genuinely receives and processes sensor data before dispatching it onward; (2) a scalable backend layer, designed around mechanisms such as queues, function-as-a-service (FaaS), or autoscaling, that processes the fog node's output and exposes a responsive dashboard for the sensor types; and (3) deployment and testing of that backend on a public cloud platform, not merely a local simulation.</w:t>
+        <w:t xml:space="preserve">This paper documents the design and construction of a fog and edge computing solution for this domain, built as an individual assignment for the Fog and Edge Computing (H9FECC) module. The brief for this coursework required three things at minimum. First, a sensor and fog layer generating data from three to five distinct sensor types with independently configurable sampling and dispatch rates, where the fog node genuinely receives and processes sensor data before dispatching it onward. Second, a scalable backend layer, designed around mechanisms such as queues, function-as-a-service (FaaS), or autoscaling, that processes the fog node's output and exposes a responsive dashboard for the sensor types. Third, deployment and testing of that backend on a public cloud platform, not merely a local simulation.</w:t>
       </w:r>
     </w:p>
     <w:p>
@@ -471,7 +471,7 @@
         <w:pStyle w:val="BodyText"/>
       </w:pPr>
       <w:r>
-        <w:t xml:space="preserve">The DynamoDB table uses sensor_type as its partition key and a composite sort key of the form window_end#site_id as its range key. This design choice is deliberate: if the sort key were window_end alone, two districts producing an aggregate for the same sensor type in the same flush cycle would collide on an identical primary key, and whichever write landed second would silently overwrite the first, permanently losing one district's reading for that window. Appending the site identifier to the sort key disambiguates the two districts' concurrent writes without requiring any additional index, and was verified directly by confirming that both districts' aggregates for a shared window are retained independently rather than one clobbering the other. The table itself runs in on-demand (pay-per-request) capacity mode rather than provisioned throughput, which removes the need to forecast a read/write capacity plan for a workload whose volume is not known in advance, at the cost of a marginally higher per-request price than well-forecast provisioned capacity would achieve; at this project's data volume the difference is immaterial, and the operational simplicity of not managing capacity was judged the better trade for a project of this scale.</w:t>
+        <w:t xml:space="preserve">The DynamoDB table uses sensor_type as its partition key and a composite sort key of the form window_end#site_id as its range key. This design choice is deliberate: if the sort key were window_end alone, two districts producing an aggregate for the same sensor type in the same flush cycle would collide on an identical primary key, and whichever write landed second would silently overwrite the first, permanently losing one district's reading for that window. Appending the site identifier to the sort key disambiguates the two districts' concurrent writes without requiring any additional index, and was verified directly by confirming that both districts' aggregates for a shared window are retained independently rather than one clobbering the other. The table itself runs in on-demand (pay-per-request) capacity mode rather than provisioned throughput. This removes the need to forecast a read/write capacity plan for a workload whose volume is not known in advance, at the cost of a marginally higher per-request price than well-forecast provisioned capacity would achieve. At this project's data volume the difference is immaterial, and the operational simplicity of not managing capacity was judged the better trade for a project of this scale.</w:t>
       </w:r>
     </w:p>
     <w:p>
@@ -495,7 +495,7 @@
         <w:pStyle w:val="BodyText"/>
       </w:pPr>
       <w:r>
-        <w:t xml:space="preserve">The dashboard was therefore migrated to a fully serverless model: its static assets (HTML, CSS, and JavaScript) are now served directly from an Amazon S3 bucket over the bucket's own HTTPS endpoint, and its small REST API was extracted into its own AWS Lambda function, reusing the existing route-handling logic unchanged through a thin adapter that translates between the API gateway's event format and the original Node.js request/response shapes. Two platform-specific constraints of the AWS Academy Learner Lab account used for this deployment were discovered empirically during this migration and are worth recording as design evidence: Amazon CloudFront is unavailable in this account, including read-only operations, so the S3 bucket is served over its own virtual-hosted-style HTTPS endpoint rather than through a CloudFront distribution; and public, unauthenticated AWS Lambda Function URLs are also blocked, confirmed by a successful authenticated invocation of the same function returning a Forbidden response when invoked through its Function URL. Amazon API Gateway [4] was not subject to either restriction and was used instead as the public entry point in front of the dashboard's Lambda function.</w:t>
+        <w:t xml:space="preserve">The dashboard was therefore migrated to a fully serverless model: its static assets (HTML, CSS, and JavaScript) are now served directly from an Amazon S3 bucket over the bucket's own HTTPS endpoint, and its small REST API was extracted into its own AWS Lambda function, reusing the existing route-handling logic unchanged through a thin adapter that translates between the API gateway's event format and the original Node.js request/response shapes. Two platform-specific constraints of the AWS Academy Learner Lab account used for this deployment were discovered empirically during this migration and are worth recording as design evidence. First, Amazon CloudFront is unavailable in this account, including read-only operations, so the S3 bucket is served over its own virtual-hosted-style HTTPS endpoint rather than through a CloudFront distribution. Second, public, unauthenticated AWS Lambda Function URLs are also blocked; this was confirmed by a successful authenticated invocation of the same function returning a Forbidden response when invoked through its Function URL. Amazon API Gateway [4] was not subject to either restriction and was used instead as the public entry point in front of the dashboard's Lambda function.</w:t>
       </w:r>
     </w:p>
     <w:p>
@@ -585,7 +585,7 @@
         <w:pStyle w:val="BodyText"/>
       </w:pPr>
       <w:r>
-        <w:t xml:space="preserve">Several alternative designs were considered and rejected, each for a specific, statable reason rather than by default. A single monolithic EC2 instance running the fog node, the processor, and the dashboard together, with no queue at all, was rejected because it collapses the backend into exactly the single point of failure and the fixed-capacity server the brief's “scalable... queues, FaaS, autoscaling” language is written to move away from: a burst of sensor traffic would compete directly with dashboard requests for the same process's CPU and event loop, rather than being absorbed by a queue.</w:t>
+        <w:t xml:space="preserve">Several alternative designs were considered and rejected, each for a specific, statable reason rather than by default. A single monolithic EC2 instance running the fog node, the processor, and the dashboard together, with no queue at all, was rejected. It would collapse the backend into exactly the single point of failure and fixed-capacity server that the brief's “scalable... queues, FaaS, autoscaling” language is written to move away from: a burst of sensor traffic would compete directly with dashboard requests for the same process's CPU and event loop, rather than being absorbed by a queue.</w:t>
       </w:r>
     </w:p>
     <w:p>
@@ -593,7 +593,7 @@
         <w:pStyle w:val="BodyText"/>
       </w:pPr>
       <w:r>
-        <w:t xml:space="preserve">Amazon Kinesis Data Streams was considered in place of SQS as the fog-to-backend transport. Kinesis is the more natural choice when multiple independent consumers must each read the full stream, or when strict, per-shard ordering is required; this system has exactly one consumer (the processor Lambda) and no ordering requirement across sensor types or districts, so SQS's simpler competing-consumer queue model, its lower cost at this data volume, and its native, zero-configuration Lambda event-source-mapping integration made it the better-justified choice for this specific workload rather than a default one.</w:t>
+        <w:t xml:space="preserve">Amazon Kinesis Data Streams was considered in place of SQS as the fog-to-backend transport. Kinesis is the more natural choice when multiple independent consumers must each read the full stream, or when strict, per-shard ordering is required. This system has exactly one consumer (the processor Lambda) and no ordering requirement across sensor types or districts. SQS's simpler competing-consumer queue model, its lower cost at this data volume, and its native, zero-configuration Lambda event-source-mapping integration together made it the better-justified choice for this specific workload, rather than a default one.</w:t>
       </w:r>
     </w:p>
     <w:p>
@@ -609,7 +609,7 @@
         <w:pStyle w:val="BodyText"/>
       </w:pPr>
       <w:r>
-        <w:t xml:space="preserve">Finally, converting the fog node and sensors themselves to a scheduled-Lambda model, so that the entire system, not only the backend, would be serverless, was considered and explicitly deferred rather than rejected outright. A continuous sensor loop and a stateful, windowed fog buffer both map awkwardly onto Lambda's stateless, time-limited invocation model without a redesign of the buffering logic itself, and the brief's cloud-deployment requirement is explicitly scoped to the backend layer rather than the sensor and fog layer; pursuing this conversion was judged to be a larger redesign than the remaining project time justified, and is recorded as future work in Section V rather than attempted partially.</w:t>
+        <w:t xml:space="preserve">Finally, converting the fog node and sensors themselves to a scheduled-Lambda model, so that the entire system, not only the backend, would be serverless, was considered and explicitly deferred rather than rejected outright. A continuous sensor loop and a stateful, windowed fog buffer both map awkwardly onto Lambda's stateless, time-limited invocation model, without a redesign of the buffering logic itself. The brief's cloud-deployment requirement is also explicitly scoped to the backend layer rather than the sensor and fog layer. Pursuing this conversion was judged to be a larger redesign than the remaining project time justified, and is recorded as future work in Section V rather than attempted partially.</w:t>
       </w:r>
     </w:p>
     <w:p>
@@ -689,7 +689,7 @@
         <w:pStyle w:val="BodyText"/>
       </w:pPr>
       <w:r>
-        <w:t xml:space="preserve">Beyond unit tests, a load-testing script bursts a configurable number of synthetic messages directly onto the real queue and asserts, first, that the queue depth is non-zero immediately after the burst (proving the messages genuinely reached SQS rather than being silently dropped), and second, that the queue depth has either fully drained or measurably decreased within a timeout window, allowing for the underlying Lambda concurrency ceiling without treating a slower-than-expected drain as a hard failure. This two-tier assertion pattern was deliberately chosen so that the load test remains a meaningful elasticity check without becoming flaky under normal, expected throughput variation. All four modules' test suites, 113 tests in total, pass against both the LocalStack-backed development environment and, where applicable, the real AWS deployment.</w:t>
+        <w:t xml:space="preserve">Beyond unit tests, a load-testing script bursts a configurable number of synthetic messages directly onto the real queue. It makes two assertions: first, that the queue depth is non-zero immediately after the burst, proving the messages genuinely reached SQS rather than being silently dropped; second, that the queue depth has either fully drained or measurably decreased within a timeout window. This second, timeout-tolerant check allows for the underlying Lambda concurrency ceiling without treating a slower-than-expected drain as a hard failure. This two-tier assertion pattern was deliberately chosen so that the load test remains a meaningful elasticity check without becoming flaky under normal, expected throughput variation. All four modules' test suites, 113 tests in total, pass against both the LocalStack-backed development environment and, where applicable, the real AWS deployment.</w:t>
       </w:r>
     </w:p>
     <w:p>
@@ -705,7 +705,7 @@
         <w:pStyle w:val="BodyText"/>
       </w:pPr>
       <w:r>
-        <w:t xml:space="preserve">A GitHub Actions workflow runs the full automated test suite for all four modules on every push to the repository, then, in a second job, brings the entire stack up with Docker Compose against LocalStack and runs a dedicated end-to-end verification script that exercises the live pipeline, submits synthetic readings, and asserts that they land in DynamoDB with the expected sort_key shape, tearing the stack back down afterwards regardless of outcome so a failed run cannot leave a stale container running for the next one.</w:t>
+        <w:t xml:space="preserve">A GitHub Actions workflow runs the full automated test suite for all four modules on every push to the repository. A second job then brings the entire stack up with Docker Compose against LocalStack and runs a dedicated end-to-end verification script that exercises the live pipeline, submits synthetic readings, and asserts that they land in DynamoDB with the expected sort_key shape. The stack is torn back down afterwards regardless of outcome, so a failed run cannot leave a stale container running for the next one.</w:t>
       </w:r>
     </w:p>
     <w:p>
@@ -713,7 +713,7 @@
         <w:pStyle w:val="BodyText"/>
       </w:pPr>
       <w:r>
-        <w:t xml:space="preserve">A second, separately triggered GitHub Actions workflow exists specifically to restart the EC2-hosted fog and sensor tier after an AWS Academy Learner Lab session ends and a fresh one begins, since the Learner Lab platform stops the EC2 instance between sessions; this workflow reads its AWS credentials from encrypted GitHub repository secrets rather than accepting them as plain workflow inputs, verifies that the credentials resolve to the expected AWS account before doing anything else, and only then starts the instance, waits for its Systems Manager agent to register, and re-verifies that fog is reachable both directly and through the dashboard API before reporting success.</w:t>
+        <w:t xml:space="preserve">A second, separately triggered GitHub Actions workflow exists specifically to restart the EC2-hosted fog and sensor tier once an AWS Academy Learner Lab session ends and a fresh one begins, since the Learner Lab platform stops the EC2 instance between sessions. It reads its AWS credentials from encrypted GitHub repository secrets rather than accepting them as plain workflow inputs, and verifies that the credentials resolve to the expected AWS account before doing anything else. Only then does it start the instance, wait for its Systems Manager agent to register, and re-verify that fog is reachable both directly and through the dashboard API before reporting success.</w:t>
       </w:r>
     </w:p>
     <w:p>
@@ -1024,7 +1024,7 @@
         <w:pStyle w:val="BodyText"/>
       </w:pPr>
       <w:r>
-        <w:t xml:space="preserve">A burst load test sent 300 synthetic messages directly to the real, deployed swm-district-agg queue in 6.15 seconds (approximately 49 messages per second), well above the sustained rate any single collection district's sensors would realistically produce. The queue depth was confirmed non-zero immediately after the burst, and on this run the real swm-processor Lambda drained the entire burst before the follow-up check even ran, evidence of real elastic throughput on the deployed system rather than a simulated result: LocalStack's own single-container Lambda executor was measurably slower at equivalent burst sizes during local development, which is the reason the load test's own drain assertion is a soft, timeout-tolerant check rather than a hard one.</w:t>
+        <w:t xml:space="preserve">A burst load test sent 300 synthetic messages directly to the real, deployed swm-district-agg queue in 6.15 seconds (approximately 49 messages per second), well above the sustained rate any single collection district's sensors would realistically produce. The queue depth was confirmed non-zero immediately after the burst. On this run, the real swm-processor Lambda drained the entire burst before the follow-up check even ran, evidence of real elastic throughput on the deployed system rather than a simulated result. LocalStack's own single-container Lambda executor was measurably slower at equivalent burst sizes during local development, which is why the load test's own drain assertion is a soft, timeout-tolerant check rather than a hard one.</w:t>
       </w:r>
     </w:p>
     <w:p>

</xml_diff>

<commit_message>
Remove self-referential brief/coursework/module mentions from the report
An IEEE-style paper should read as a standalone technical document, not
reveal it was written to satisfy a specific assignment brief. Removed
11 phrases across the Abstract, Introduction, Scalable Backend Layer,
Dashboard Migration, Critical Analysis, Real AWS Deployment, and
Conclusion sections that referenced "the brief", "this coursework",
"the H9FECC module", or "the module's assessment criterion", rewording
each to state the same requirement or finding on its own terms.

Also replaced the title page's IEEE placeholder copyright line
("XXX-X-XXXX-XXXX-X/XX/$XX.00 (c)20XX IEEE") with an actual page
number, and added a matching page-number footer to the remaining
pages so numbering runs 1-6 consistently throughout.

Re-validated against the template XSD and re-rendered all 6 pages to
confirm no regressions.
</commit_message>
<xml_diff>
--- a/documents/Gundeti_Sachin_Reddy_X23432721/report.docx
+++ b/documents/Gundeti_Sachin_Reddy_X23432721/report.docx
@@ -58,11 +58,10 @@
           <w:szCs w:val="16"/>
         </w:rPr>
         <w:sectPr>
-          <w:footerReference w:type="first" r:id="rId8"/>
+          <w:footerReference w:type="default" r:id="rId8"/>
           <w:pgSz w:w="595.30pt" w:h="841.90pt" w:code="9"/>
           <w:pgMar w:top="27pt" w:right="44.65pt" w:bottom="72pt" w:left="44.65pt" w:header="36pt" w:footer="36pt" w:gutter="0pt"/>
           <w:cols w:space="36pt"/>
-          <w:titlePg/>
           <w:docGrid w:linePitch="360"/>
         </w:sectPr>
       </w:pPr>
@@ -79,7 +78,7 @@
         <w:t xml:space="preserve">Abstract</w:t>
       </w:r>
       <w:r>
-        <w:t xml:space="preserve">—This paper presents the design, implementation, and real-world cloud deployment of a fog and edge computing pipeline for smart municipal waste management. The system simulates five distinct sensor types (bin fill level, internal temperature, gas concentration, bin weight, and lid-open events) across two collection districts, each independently configurable for sampling and dispatch frequency. A Node.js fog node performs windowed aggregation and threshold-based alerting before dispatching processed batches to a scalable cloud backend built from Amazon SQS, AWS Lambda, and Amazon DynamoDB. The dashboard, originally hosted on a persistent EC2 instance, was subsequently migrated to a fully serverless architecture (Amazon S3, AWS Lambda, and Amazon API Gateway) to align the entire backend with the module's function-as-a-service scalability criterion and to resolve a genuine campus-network access restriction. The complete system was deployed and tested on a real AWS account rather than a local emulator alone, which surfaced defects invisible to local testing, including credential-handling bugs that only manifest under real temporary AWS credentials, and undocumented platform restrictions specific to the AWS Academy Learner Lab environment. This paper critically analyses the architectural decisions taken, the defects discovered during real deployment, and the lessons learned for building genuinely cloud-native fog computing systems.</w:t>
+        <w:t xml:space="preserve">—This paper presents the design, implementation, and real-world cloud deployment of a fog and edge computing pipeline for smart municipal waste management. The system simulates five distinct sensor types (bin fill level, internal temperature, gas concentration, bin weight, and lid-open events) across two collection districts, each independently configurable for sampling and dispatch frequency. A Node.js fog node performs windowed aggregation and threshold-based alerting before dispatching processed batches to a scalable cloud backend built from Amazon SQS, AWS Lambda, and Amazon DynamoDB. The dashboard, originally hosted on a persistent EC2 instance, was subsequently migrated to a fully serverless architecture (Amazon S3, AWS Lambda, and Amazon API Gateway) to align the entire backend with a function-as-a-service scalability model and to resolve a genuine campus-network access restriction. The complete system was deployed and tested on a real AWS account rather than a local emulator alone, which surfaced defects invisible to local testing, including credential-handling bugs that only manifest under real temporary AWS credentials, and undocumented platform restrictions specific to the AWS Academy Learner Lab environment. This paper critically analyses the architectural decisions taken, the defects discovered during real deployment, and the lessons learned for building genuinely cloud-native fog computing systems.</w:t>
       </w:r>
     </w:p>
     <w:p>
@@ -119,7 +118,7 @@
         <w:pStyle w:val="BodyText"/>
       </w:pPr>
       <w:r>
-        <w:t xml:space="preserve">This paper documents the design and construction of a fog and edge computing solution for this domain, built as an individual assignment for the Fog and Edge Computing (H9FECC) module. The brief for this coursework required three things at minimum. First, a sensor and fog layer generating data from three to five distinct sensor types with independently configurable sampling and dispatch rates, where the fog node genuinely receives and processes sensor data before dispatching it onward. Second, a scalable backend layer, designed around mechanisms such as queues, function-as-a-service (FaaS), or autoscaling, that processes the fog node's output and exposes a responsive dashboard for the sensor types. Third, deployment and testing of that backend on a public cloud platform, not merely a local simulation.</w:t>
+        <w:t xml:space="preserve">This paper documents the design and construction of a fog and edge computing solution for this domain. The system was designed to satisfy three requirements at minimum. First, a sensor and fog layer generating data from three to five distinct sensor types with independently configurable sampling and dispatch rates, where the fog node genuinely receives and processes sensor data before dispatching it onward. Second, a scalable backend layer, designed around mechanisms such as queues, function-as-a-service (FaaS), or autoscaling, that processes the fog node's output and exposes a responsive dashboard for the sensor types. Third, deployment and testing of that backend on a public cloud platform, not merely a local simulation.</w:t>
       </w:r>
     </w:p>
     <w:p>
@@ -151,7 +150,7 @@
         <w:pStyle w:val="BodyText"/>
       </w:pPr>
       <w:r>
-        <w:t xml:space="preserve">The simulated deployment models two waste-collection districts, district-a and district-b, each instrumented with five sensor types: fill_level_pct, internal_temp_c, gas_level_ppm, bin_weight_kg, and lid_open_count. Every one of the ten resulting sensor processes (five types across two districts) exposes two independent, separately configurable environment variables, SAMPLE_INTERVAL and DISPATCH_INTERVAL, satisfying the brief's requirement that generation frequency and dispatch rate be genuinely decoupled knobs rather than a single aliased value. Each sensor process was verified to hold a pairwise-distinct combination of these two values, since a duplicated pair would otherwise silently fail to demonstrate that the two knobs are truly independent.</w:t>
+        <w:t xml:space="preserve">The simulated deployment models two waste-collection districts, district-a and district-b, each instrumented with five sensor types: fill_level_pct, internal_temp_c, gas_level_ppm, bin_weight_kg, and lid_open_count. Every one of the ten resulting sensor processes (five types across two districts) exposes two independent, separately configurable environment variables, SAMPLE_INTERVAL and DISPATCH_INTERVAL, so that generation frequency and dispatch rate are genuinely decoupled knobs rather than a single aliased value. Each sensor process was verified to hold a pairwise-distinct combination of these two values, since a duplicated pair would otherwise silently fail to demonstrate that the two knobs are truly independent.</w:t>
       </w:r>
     </w:p>
     <w:p>
@@ -455,7 +454,7 @@
         <w:pStyle w:val="BodyText"/>
       </w:pPr>
       <w:r>
-        <w:t xml:space="preserve">The backend layer is built entirely from managed, scalable AWS primitives rather than a hand-rolled server: an Amazon SQS [3] standard queue decouples the fog node's dispatch rate from the backend's processing rate, and an AWS Lambda [1] function, subscribed to that queue via an event-source mapping, is invoked automatically as messages arrive, writing each aggregated window into an Amazon DynamoDB [2] table. This queue-plus-FaaS pairing is one of the scalability mechanisms the brief explicitly names as an example, and it was chosen specifically because it requires no server capacity planning: the queue absorbs bursts, and Lambda's own concurrency model scales the number of concurrent invocations to the backlog without any manual provisioning.</w:t>
+        <w:t xml:space="preserve">The backend layer is built entirely from managed, scalable AWS primitives rather than a hand-rolled server: an Amazon SQS [3] standard queue decouples the fog node's dispatch rate from the backend's processing rate, and an AWS Lambda [1] function, subscribed to that queue via an event-source mapping, is invoked automatically as messages arrive, writing each aggregated window into an Amazon DynamoDB [2] table. This queue-plus-FaaS pairing is a canonical scalability mechanism for exactly this kind of bursty, asynchronous workload, and it was chosen specifically because it requires no server capacity planning: the queue absorbs bursts, and Lambda's own concurrency model scales the number of concurrent invocations to the backlog without any manual provisioning.</w:t>
       </w:r>
     </w:p>
     <w:p>
@@ -487,7 +486,7 @@
         <w:pStyle w:val="BodyText"/>
       </w:pPr>
       <w:r>
-        <w:t xml:space="preserve">The dashboard was originally implemented as a fourth long-running container alongside the fog node and the ten sensor processes, exposing a small REST API and a static single-page frontend from one Node.js HTTP server on a dedicated port of the same EC2 instance used for the fog node. This was a pragmatic first deployment, but on critical review it had two weaknesses. First, it was the one piece of the “scalable backend” requirement still resting on a persistent server rather than on a queue or FaaS mechanism, unlike every other backend component. Second, and more concretely, a raw EC2 public IP address on a non-standard port served over plain HTTP is exactly the traffic shape that campus and corporate WiFi networks commonly block by policy; this was confirmed as a genuine, reported access failure rather than a hypothetical concern.</w:t>
+        <w:t xml:space="preserve">The dashboard was originally implemented as a fourth long-running container alongside the fog node and the ten sensor processes, exposing a small REST API and a static single-page frontend from one Node.js HTTP server on a dedicated port of the same EC2 instance used for the fog node. This was a pragmatic first deployment, but on critical review it had two weaknesses. First, it was the one backend component still resting on a persistent server rather than on a queue or FaaS mechanism, unlike every other component, which undercut the system's own scalability design. Second, and more concretely, a raw EC2 public IP address on a non-standard port served over plain HTTP is exactly the traffic shape that campus and corporate WiFi networks commonly block by policy; this was confirmed as a genuine, reported access failure rather than a hypothetical concern.</w:t>
       </w:r>
     </w:p>
     <w:p>
@@ -585,7 +584,7 @@
         <w:pStyle w:val="BodyText"/>
       </w:pPr>
       <w:r>
-        <w:t xml:space="preserve">Several alternative designs were considered and rejected, each for a specific, statable reason rather than by default. A single monolithic EC2 instance running the fog node, the processor, and the dashboard together, with no queue at all, was rejected. It would collapse the backend into exactly the single point of failure and fixed-capacity server that the brief's “scalable... queues, FaaS, autoscaling” language is written to move away from: a burst of sensor traffic would compete directly with dashboard requests for the same process's CPU and event loop, rather than being absorbed by a queue.</w:t>
+        <w:t xml:space="preserve">Several alternative designs were considered and rejected, each for a specific, statable reason rather than by default. A single monolithic EC2 instance running the fog node, the processor, and the dashboard together, with no queue at all, was rejected. It would collapse the backend into exactly the single point of failure and fixed-capacity server that a scalable, queue-based, FaaS-driven design is meant to avoid: a burst of sensor traffic would compete directly with dashboard requests for the same process's CPU and event loop, rather than being absorbed by a queue.</w:t>
       </w:r>
     </w:p>
     <w:p>
@@ -609,7 +608,7 @@
         <w:pStyle w:val="BodyText"/>
       </w:pPr>
       <w:r>
-        <w:t xml:space="preserve">Finally, converting the fog node and sensors themselves to a scheduled-Lambda model, so that the entire system, not only the backend, would be serverless, was considered and explicitly deferred rather than rejected outright. A continuous sensor loop and a stateful, windowed fog buffer both map awkwardly onto Lambda's stateless, time-limited invocation model, without a redesign of the buffering logic itself. The brief's cloud-deployment requirement is also explicitly scoped to the backend layer rather than the sensor and fog layer. Pursuing this conversion was judged to be a larger redesign than the remaining project time justified, and is recorded as future work in Section V rather than attempted partially.</w:t>
+        <w:t xml:space="preserve">Finally, converting the fog node and sensors themselves to a scheduled-Lambda model, so that the entire system, not only the backend, would be serverless, was considered and explicitly deferred rather than rejected outright. A continuous sensor loop and a stateful, windowed fog buffer both map awkwardly onto Lambda's stateless, time-limited invocation model, without a redesign of the buffering logic itself. This project's cloud-deployment scope is also limited to the backend layer rather than the sensor and fog layer. Pursuing this conversion was judged to be a larger redesign than the remaining project time justified, and is recorded as future work in Section V rather than attempted partially.</w:t>
       </w:r>
     </w:p>
     <w:p>
@@ -729,7 +728,7 @@
         <w:pStyle w:val="BodyText"/>
       </w:pPr>
       <w:r>
-        <w:t xml:space="preserve">The complete system, including the sensor and fog tier, the SQS queue, both Lambda functions, the DynamoDB table, the API Gateway endpoint, and the S3-hosted frontend, was deployed to a real AWS account (an AWS Academy Learner Lab account) in region us-east-1, satisfying the brief's requirement that the backend be deployed and tested on an actual public cloud platform rather than only a local emulator. This real deployment was directly responsible for surfacing three classes of defect that the local, LocalStack-backed test suite had not caught.</w:t>
+        <w:t xml:space="preserve">The complete system, including the sensor and fog tier, the SQS queue, both Lambda functions, the DynamoDB table, the API Gateway endpoint, and the S3-hosted frontend, was deployed to a real AWS account (an AWS Academy Learner Lab account) in region us-east-1, so that the backend was deployed and tested on an actual public cloud platform rather than only a local emulator. This real deployment was directly responsible for surfacing three classes of defect that the local, LocalStack-backed test suite had not caught.</w:t>
       </w:r>
     </w:p>
     <w:p>
@@ -1080,7 +1079,7 @@
         <w:pStyle w:val="BodyText"/>
       </w:pPr>
       <w:r>
-        <w:t xml:space="preserve">This project set out to build a complete fog and edge computing pipeline for smart waste management, satisfying the module brief's requirements for a configurable sensor and fog layer, a scalable cloud backend, and genuine deployment and testing on a public cloud platform, and to critically analyse the architectural decisions taken at each layer against the alternatives available. All three layers were implemented, tested, and deployed to a real AWS account rather than a local simulation alone.</w:t>
+        <w:t xml:space="preserve">This project set out to build a complete fog and edge computing pipeline for smart waste management, with a configurable sensor and fog layer, a scalable cloud backend, and genuine deployment and testing on a public cloud platform, and to critically analyse the architectural decisions taken at each layer against the alternatives available. All three layers were implemented, tested, and deployed to a real AWS account rather than a local simulation alone.</w:t>
       </w:r>
     </w:p>
     <w:p>
@@ -1088,7 +1087,7 @@
         <w:pStyle w:val="BodyText"/>
       </w:pPr>
       <w:r>
-        <w:t xml:space="preserve">The most significant finding of this project is not architectural but methodological: local testing against a cloud emulator, however thorough, is not a substitute for testing against the real target platform. Every defect discovered during the real AWS deployment, the credential-handling bug, the Lambda response-format bug, and the API Gateway permission gap, passed the full local test suite and a full LocalStack-backed integration test cleanly, and would have shipped undetected had the project stopped at the local-simulation stage. This directly reinforces the module's own assessment criterion that each layer be “developed, tested, and deployed” as three distinct activities, not a single combined one.</w:t>
+        <w:t xml:space="preserve">The most significant finding of this project is not architectural but methodological: local testing against a cloud emulator, however thorough, is not a substitute for testing against the real target platform. Every defect discovered during the real AWS deployment, the credential-handling bug, the Lambda response-format bug, and the API Gateway permission gap, passed the full local test suite and a full LocalStack-backed integration test cleanly, and would have shipped undetected had the project stopped at the local-simulation stage. This directly reinforces the broader principle that each layer should be “developed, tested, and deployed” as three distinct activities, not a single combined one.</w:t>
       </w:r>
     </w:p>
     <w:p>
@@ -1199,6 +1198,7 @@
     </w:p>
     <w:sectPr>
       <w:type w:val="continuous"/>
+      <w:footerReference w:type="default" r:id="rId8"/>
       <w:pgSz w:w="595.30pt" w:h="841.90pt" w:code="9"/>
       <w:pgMar w:top="54pt" w:right="45.35pt" w:bottom="72pt" w:left="45.35pt" w:header="36pt" w:footer="36pt" w:gutter="0pt"/>
       <w:cols w:num="2" w:space="18pt"/>
@@ -1232,19 +1232,21 @@
   <w:p>
     <w:pPr>
       <w:pStyle w:val="Footer"/>
-      <w:jc w:val="start"/>
+      <w:jc w:val="center"/>
       <w:rPr>
         <w:sz w:val="16"/>
         <w:szCs w:val="16"/>
       </w:rPr>
     </w:pPr>
-    <w:r>
-      <w:rPr>
-        <w:sz w:val="16"/>
-        <w:szCs w:val="16"/>
-      </w:rPr>
-      <w:t>XXX-X-XXXX-XXXX-X/XX/$XX.00 ©20XX IEEE</w:t>
-    </w:r>
+    <w:fldSimple w:instr=" PAGE ">
+      <w:r>
+        <w:rPr>
+          <w:sz w:val="16"/>
+          <w:szCs w:val="16"/>
+        </w:rPr>
+        <w:t>1</w:t>
+      </w:r>
+    </w:fldSimple>
   </w:p>
 </w:ftr>
 </file>

</xml_diff>

<commit_message>
Add module name (Fog and Edge Computing, H9FECC) to author block
</commit_message>
<xml_diff>
--- a/documents/Gundeti_Sachin_Reddy_X23432721/report.docx
+++ b/documents/Gundeti_Sachin_Reddy_X23432721/report.docx
@@ -26,6 +26,16 @@
           <w:iCs/>
         </w:rPr>
         <w:t xml:space="preserve">MSc in Cloud Computing</w:t>
+      </w:r>
+      <w:r>
+        <w:br/>
+      </w:r>
+      <w:r>
+        <w:rPr>
+          <w:i/>
+          <w:iCs/>
+        </w:rPr>
+        <w:t xml:space="preserve">Fog and Edge Computing (H9FECC)</w:t>
       </w:r>
       <w:r>
         <w:br/>

</xml_diff>

<commit_message>
Fix Fig. 1 being clipped to column width, hiding 5 of 9 components
A fresh multi-agent rubric re-verification caught a real defect: the
deployment-topology figure was displayed at 6in width but placed inline
inside a 2-column section, so only the ~3.4in-wide left portion
(Sensors, Fog Node, SQS, part of API Gateway) rendered -- both Lambda
functions, DynamoDB, S3, and the Browser box were entirely cut off,
even though the source PNG and caption both describe the full diagram.

Fixed by wrapping the figure and its caption in their own single-column
continuous section (matching the technique already used for the
title/abstract 1-to-2-column transition), so the image displays at its
full intended width instead of being cropped. Verified by rendering all
6 pages: the figure now shows all 9 components, caption sits directly
beneath it, and the surrounding 2-column text resumes correctly on
either side with no blank pages or pagination changes.
</commit_message>
<xml_diff>
--- a/documents/Gundeti_Sachin_Reddy_X23432721/report.docx
+++ b/documents/Gundeti_Sachin_Reddy_X23432721/report.docx
@@ -524,6 +524,14 @@
     <w:p>
       <w:pPr>
         <w:pStyle w:val="BodyText"/>
+        <w:sectPr>
+          <w:type w:val="continuous"/>
+          <w:footerReference w:type="default" r:id="rId8"/>
+          <w:pgSz w:w="595.30pt" w:h="841.90pt" w:code="9"/>
+          <w:pgMar w:top="54pt" w:right="45.35pt" w:bottom="72pt" w:left="45.35pt" w:header="36pt" w:footer="36pt" w:gutter="0pt"/>
+          <w:cols w:num="2" w:space="18pt"/>
+          <w:docGrid w:linePitch="360"/>
+        </w:sectPr>
       </w:pPr>
       <w:r>
         <w:t xml:space="preserve">Fig. 1 summarises the resulting topology. Sensor processes and the fog node run in Docker containers on a single EC2 instance, managed entirely through AWS Systems Manager Session Manager rather than SSH, so no key pair is provisioned and no inbound SSH port is opened on the instance's security group. The fog node dispatches aggregated windows to an SQS queue, which triggers a Lambda function that writes to a DynamoDB table. A second Lambda function, sitting behind an API Gateway HTTP API, reads from that same table (and from the queue and the first Lambda function's own metadata) to answer the dashboard's REST API calls, while the dashboard's static frontend is served independently from Amazon S3, reached directly by the browser. This topology places every backend component except the sensor and fog tier behind a managed, serverless service boundary.</w:t>
@@ -574,6 +582,14 @@
     <w:p>
       <w:pPr>
         <w:pStyle w:val="figurecaption"/>
+        <w:sectPr>
+          <w:type w:val="continuous"/>
+          <w:footerReference w:type="default" r:id="rId8"/>
+          <w:pgSz w:w="595.30pt" w:h="841.90pt" w:code="9"/>
+          <w:pgMar w:top="54pt" w:right="45.35pt" w:bottom="72pt" w:left="45.35pt" w:header="36pt" w:footer="36pt" w:gutter="0pt"/>
+          <w:cols w:space="18pt"/>
+          <w:docGrid w:linePitch="360"/>
+        </w:sectPr>
       </w:pPr>
       <w:r>
         <w:t xml:space="preserve">Deployment topology: sensors and the fog node run on EC2; the backend (SQS, both Lambda functions, DynamoDB, API Gateway) is fully serverless; the frontend is served from S3.</w:t>

</xml_diff>